<commit_message>
Strengthen "plumbing matters" with in-language loyalty + retention economics
Weave in the retention case: ~75% of consumers more likely to repurchase
when supported in their own language (CSA Research), the bilingual
first-language preference for high-stakes calls, 40M+ Spanish-at-home
(Census), and the ~5x cost of acquiring vs. retaining a customer (HBR),
tying attrition during a conversion back to the deal economics. Prose,
not a stat dump. No em dashes.

Co-Authored-By: Claude Opus 4.8 <noreply@anthropic.com>
Claude-Session: https://claude.ai/code/session_01WdmaS8fb3WHmxD5MVo6UfL
</commit_message>
<xml_diff>
--- a/blog/Credit-Unions-Buying-Banks-Integration.docx
+++ b/blog/Credit-Unions-Buying-Banks-Integration.docx
@@ -67,7 +67,7 @@
         </w:rPr>
         <w:t xml:space="preserve">Credit unions have spent the past few years doing something that once seemed unlikely: buying banks outright. The pace peaked at a </w:t>
       </w:r>
-      <w:hyperlink w:history="1" r:id="rId52g9kdcjo7wadll0p_pkv">
+      <w:hyperlink w:history="1" r:id="rIdd_4g-wv-4oisjgddi5x2_">
         <w:r>
           <w:rPr>
             <w:rStyle w:val="Hyperlink"/>
@@ -84,7 +84,7 @@
         </w:rPr>
         <w:t xml:space="preserve">, cooled to roughly 16 in 2025, and has slowed again to </w:t>
       </w:r>
-      <w:hyperlink w:history="1" r:id="rIdbs6gkfxiyojlhs7jvs5jm">
+      <w:hyperlink w:history="1" r:id="rId28rqp5n6eojpvql2izgws">
         <w:r>
           <w:rPr>
             <w:rStyle w:val="Hyperlink"/>
@@ -101,7 +101,7 @@
         </w:rPr>
         <w:t xml:space="preserve">. But slower is not stopped. In August, </w:t>
       </w:r>
-      <w:hyperlink w:history="1" r:id="rIdydnko8-deacvm5f36adzp">
+      <w:hyperlink w:history="1" r:id="rIdnnveg1hpwhlls5-fhlncy">
         <w:r>
           <w:rPr>
             <w:rStyle w:val="Hyperlink"/>
@@ -118,7 +118,7 @@
         </w:rPr>
         <w:t xml:space="preserve">, a Roswell, New Mexico bank, with the deal set to close November 1. Florida's Gulf Winds Credit Union struck </w:t>
       </w:r>
-      <w:hyperlink w:history="1" r:id="rIdfjgp6vzs176oyufitr2qe">
+      <w:hyperlink w:history="1" r:id="rId1pjyhrwgnk8uexja7imxc">
         <w:r>
           <w:rPr>
             <w:rStyle w:val="Hyperlink"/>
@@ -135,7 +135,7 @@
         </w:rPr>
         <w:t xml:space="preserve"> and is rebranding itself TruWorth. (The deal often cited as a milestone, ESL's purchase of Generations Bank, was actually </w:t>
       </w:r>
-      <w:hyperlink w:history="1" r:id="rIdih9h7qh5t0fpwtjkf5f-9">
+      <w:hyperlink w:history="1" r:id="rIdb8v8k8m6pynlhizfmy9ax">
         <w:r>
           <w:rPr>
             <w:rStyle w:val="Hyperlink"/>
@@ -164,7 +164,7 @@
         </w:rPr>
         <w:t xml:space="preserve">The logic is straightforward. Acquiring a bank lets a credit union </w:t>
       </w:r>
-      <w:hyperlink w:history="1" r:id="rIdntpia77l_cqomqgvjvsty">
+      <w:hyperlink w:history="1" r:id="rIdrywvx4hjjl5bpme8fzsxo">
         <w:r>
           <w:rPr>
             <w:rStyle w:val="Hyperlink"/>
@@ -208,7 +208,7 @@
         </w:rPr>
         <w:t xml:space="preserve">The part that gets underestimated sits on the other side of the closing date. When a credit union absorbs a bank, it does not just acquire deposits and branches. It </w:t>
       </w:r>
-      <w:hyperlink w:history="1" r:id="rIddbhtivwzeqwbt3dupj6rf">
+      <w:hyperlink w:history="1" r:id="rIdtlcoinka4i29jmrr28pvj">
         <w:r>
           <w:rPr>
             <w:rStyle w:val="Hyperlink"/>
@@ -262,7 +262,7 @@
           <w:sz w:val="22"/>
           <w:szCs w:val="22"/>
         </w:rPr>
-        <w:t xml:space="preserve">This is where the unglamorous infrastructure of an integration earns its keep. Over-the-phone interpretation, the on-demand service that puts a live interpreter onto a member call within seconds, turns a contact center into one that can calmly handle a worried Spanish-speaking member on the day their bank becomes a credit union. Document translation keeps disclosures and account agreements both compliant and clear in every language. Multilingual onboarding and member communications carry the relationship through the rebrand. For an institution folding in tens of thousands of new members, these are not add-ons. They are the connective tissue that decides whether the acquired customers stay.</w:t>
+        <w:t xml:space="preserve">This is where the unglamorous infrastructure of an integration earns its keep. Over-the-phone interpretation, the on-demand service that puts a live interpreter onto a member call within seconds, turns a contact center into one that can calmly handle a worried Spanish-speaking member on the day their bank becomes a credit union. Document translation keeps disclosures and account agreements both compliant and clear in every language. Multilingual onboarding and member communications carry the relationship through the rebrand.</w:t>
       </w:r>
     </w:p>
     <w:p>
@@ -274,7 +274,70 @@
           <w:sz w:val="22"/>
           <w:szCs w:val="22"/>
         </w:rPr>
-        <w:t xml:space="preserve">It is worth remembering why the deal happened in the first place. Credit unions are buying banks to grow, to add members, deposits, and lending relationships they could not build fast enough on their own. Losing a meaningful slice of those members in a clumsy, English-only transition would quietly undo the economics of the purchase.</w:t>
+        <w:t xml:space="preserve">The payoff is not abstract. Around </w:t>
+      </w:r>
+      <w:hyperlink w:history="1" r:id="rIdwzxzfcfr1yjmgt52hitaj">
+        <w:r>
+          <w:rPr>
+            <w:rStyle w:val="Hyperlink"/>
+            <w:sz w:val="22"/>
+            <w:szCs w:val="22"/>
+          </w:rPr>
+          <w:t xml:space="preserve">three in four consumers say they are more likely to keep buying from a brand that supports them in their own language</w:t>
+        </w:r>
+      </w:hyperlink>
+      <w:r>
+        <w:rPr>
+          <w:sz w:val="22"/>
+          <w:szCs w:val="22"/>
+        </w:rPr>
+        <w:t xml:space="preserve">, and the preference sharpens at exactly the wrong moment to lose someone. Even bilingual customers tend to switch to their first language for conversations that are emotional, complex, or high-stakes, which is a fair description of "my bank just became a credit union and my login stopped working." With </w:t>
+      </w:r>
+      <w:hyperlink w:history="1" r:id="rIdpp98fn1nvgwlagejfc5u9">
+        <w:r>
+          <w:rPr>
+            <w:rStyle w:val="Hyperlink"/>
+            <w:sz w:val="22"/>
+            <w:szCs w:val="22"/>
+          </w:rPr>
+          <w:t xml:space="preserve">more than 40 million people speaking Spanish at home in the United States</w:t>
+        </w:r>
+      </w:hyperlink>
+      <w:r>
+        <w:rPr>
+          <w:sz w:val="22"/>
+          <w:szCs w:val="22"/>
+        </w:rPr>
+        <w:t xml:space="preserve">, that instinct is not a niche to serve as an afterthought.</w:t>
+      </w:r>
+    </w:p>
+    <w:p>
+      <w:pPr>
+        <w:spacing w:after="160" w:line="288"/>
+      </w:pPr>
+      <w:r>
+        <w:rPr>
+          <w:sz w:val="22"/>
+          <w:szCs w:val="22"/>
+        </w:rPr>
+        <w:t xml:space="preserve">And the arithmetic is unforgiving. Winning a new customer costs </w:t>
+      </w:r>
+      <w:hyperlink w:history="1" r:id="rIdinwugi3kdf_ddhnz-7s3a">
+        <w:r>
+          <w:rPr>
+            <w:rStyle w:val="Hyperlink"/>
+            <w:sz w:val="22"/>
+            <w:szCs w:val="22"/>
+          </w:rPr>
+          <w:t xml:space="preserve">roughly five times as much, by some estimates far more, as keeping an existing one</w:t>
+        </w:r>
+      </w:hyperlink>
+      <w:r>
+        <w:rPr>
+          <w:sz w:val="22"/>
+          <w:szCs w:val="22"/>
+        </w:rPr>
+        <w:t xml:space="preserve">, which makes attrition during a conversion the most expensive churn there is. Credit unions buy banks precisely to add members, deposits, and lending relationships they could not build fast enough on their own. Losing a meaningful slice of those members in a clumsy, English-only transition does not just dent a satisfaction score. It quietly undoes the economics of the purchase.</w:t>
       </w:r>
     </w:p>
     <w:p>
@@ -349,7 +412,7 @@
         </w:rPr>
         <w:t xml:space="preserve"> </w:t>
       </w:r>
-      <w:hyperlink w:history="1" r:id="rIdcl3opubedwjv-apac7ygf">
+      <w:hyperlink w:history="1" r:id="rIdohs4k_vlzubqed5aohxza">
         <w:r>
           <w:rPr>
             <w:rStyle w:val="Hyperlink"/>
@@ -366,7 +429,7 @@
         </w:rPr>
         <w:t xml:space="preserve"> and </w:t>
       </w:r>
-      <w:hyperlink w:history="1" r:id="rIdoo2148qdosihevjbjdndj">
+      <w:hyperlink w:history="1" r:id="rId8xrds2w4x-fhfcjuvbarh">
         <w:r>
           <w:rPr>
             <w:rStyle w:val="Hyperlink"/>
@@ -442,7 +505,7 @@
         </w:rPr>
         <w:t xml:space="preserve">GECU Receives Regulatory Approval to Acquire Bank of the Southwest (closes Nov 1, 2026; expands into New Mexico): </w:t>
       </w:r>
-      <w:hyperlink w:history="1" r:id="rIdbzyyiakqopg9nmh4zujyp">
+      <w:hyperlink w:history="1" r:id="rIdbuzcvryh5ec6qjbu28ecw">
         <w:r>
           <w:rPr>
             <w:rStyle w:val="Hyperlink"/>
@@ -459,7 +522,7 @@
         </w:rPr>
         <w:t xml:space="preserve"> · </w:t>
       </w:r>
-      <w:hyperlink w:history="1" r:id="rIdjputqt6xn4jnxtpj1-lix">
+      <w:hyperlink w:history="1" r:id="rIdhf_y39ue245eujlxmh553">
         <w:r>
           <w:rPr>
             <w:rStyle w:val="Hyperlink"/>
@@ -486,7 +549,7 @@
         </w:rPr>
         <w:t xml:space="preserve">Gulf Winds Credit Union to acquire Madison County Community Bank and Peoples Exchange Bank; rebrand to TruWorth: </w:t>
       </w:r>
-      <w:hyperlink w:history="1" r:id="rIdpldpuybt3nly2siqbpqmm">
+      <w:hyperlink w:history="1" r:id="rIdnlyyp8p75ok1nzo3wmqo-">
         <w:r>
           <w:rPr>
             <w:rStyle w:val="Hyperlink"/>
@@ -503,7 +566,7 @@
         </w:rPr>
         <w:t xml:space="preserve"> · </w:t>
       </w:r>
-      <w:hyperlink w:history="1" r:id="rIdls5vbvodqhxup0mjv4a9h">
+      <w:hyperlink w:history="1" r:id="rIdlbypo4vdnz-pmn31c4sax">
         <w:r>
           <w:rPr>
             <w:rStyle w:val="Hyperlink"/>
@@ -530,7 +593,7 @@
         </w:rPr>
         <w:t xml:space="preserve">Credit union-bank deals hit a record 22 in 2024: </w:t>
       </w:r>
-      <w:hyperlink w:history="1" r:id="rIduws-7gnuxberfws4du4ys">
+      <w:hyperlink w:history="1" r:id="rIdvjgbhtjgkqtiav_pq22ne">
         <w:r>
           <w:rPr>
             <w:rStyle w:val="Hyperlink"/>
@@ -557,7 +620,7 @@
         </w:rPr>
         <w:t xml:space="preserve">ESL to buy Generations Bank (2024's 16th CU-bank deal; closed Jan 1, 2026): </w:t>
       </w:r>
-      <w:hyperlink w:history="1" r:id="rIdo3pui46sj_iyhhpoz-uwx">
+      <w:hyperlink w:history="1" r:id="rIdefhunt2glim5t4p8oxm4n">
         <w:r>
           <w:rPr>
             <w:rStyle w:val="Hyperlink"/>
@@ -574,7 +637,7 @@
         </w:rPr>
         <w:t xml:space="preserve"> · </w:t>
       </w:r>
-      <w:hyperlink w:history="1" r:id="rId6ze8yjc_xpom7xw7idibw">
+      <w:hyperlink w:history="1" r:id="rId2i4p2iconejwqw01zq82t">
         <w:r>
           <w:rPr>
             <w:rStyle w:val="Hyperlink"/>
@@ -601,7 +664,7 @@
         </w:rPr>
         <w:t xml:space="preserve">Why credit unions are buying community banks: </w:t>
       </w:r>
-      <w:hyperlink w:history="1" r:id="rIdpafjty1d03a61x7cihga6">
+      <w:hyperlink w:history="1" r:id="rIdx7fdolcawognzl27ttxom">
         <w:r>
           <w:rPr>
             <w:rStyle w:val="Hyperlink"/>
@@ -628,7 +691,7 @@
         </w:rPr>
         <w:t xml:space="preserve">How credit unions can integrate acquired bank customers: </w:t>
       </w:r>
-      <w:hyperlink w:history="1" r:id="rId4rcpwfst7q2iht4f2eg3v">
+      <w:hyperlink w:history="1" r:id="rIdeu-8ppo7vjvtl_ktno9y2">
         <w:r>
           <w:rPr>
             <w:rStyle w:val="Hyperlink"/>
@@ -639,8 +702,89 @@
         </w:r>
       </w:hyperlink>
     </w:p>
+    <w:p>
+      <w:pPr>
+        <w:pStyle w:val="ListParagraph"/>
+        <w:numPr>
+          <w:ilvl w:val="0"/>
+          <w:numId w:val="2"/>
+        </w:numPr>
+        <w:spacing w:after="100" w:line="288"/>
+      </w:pPr>
+      <w:r>
+        <w:rPr>
+          <w:sz w:val="22"/>
+          <w:szCs w:val="22"/>
+        </w:rPr>
+        <w:t xml:space="preserve">Consumers prefer their own language (~75% more likely to repurchase when care is in-language): </w:t>
+      </w:r>
+      <w:hyperlink w:history="1" r:id="rIdtzd6led7_f_2lvpgrpdyc">
+        <w:r>
+          <w:rPr>
+            <w:rStyle w:val="Hyperlink"/>
+            <w:sz w:val="22"/>
+            <w:szCs w:val="22"/>
+          </w:rPr>
+          <w:t xml:space="preserve">CSA Research</w:t>
+        </w:r>
+      </w:hyperlink>
+    </w:p>
+    <w:p>
+      <w:pPr>
+        <w:pStyle w:val="ListParagraph"/>
+        <w:numPr>
+          <w:ilvl w:val="0"/>
+          <w:numId w:val="2"/>
+        </w:numPr>
+        <w:spacing w:after="100" w:line="288"/>
+      </w:pPr>
+      <w:r>
+        <w:rPr>
+          <w:sz w:val="22"/>
+          <w:szCs w:val="22"/>
+        </w:rPr>
+        <w:t xml:space="preserve">Languages spoken at home in the US (40M+ Spanish): </w:t>
+      </w:r>
+      <w:hyperlink w:history="1" r:id="rIdxqwd6gjovtshmwfog-cx4">
+        <w:r>
+          <w:rPr>
+            <w:rStyle w:val="Hyperlink"/>
+            <w:sz w:val="22"/>
+            <w:szCs w:val="22"/>
+          </w:rPr>
+          <w:t xml:space="preserve">U.S. Census Bureau</w:t>
+        </w:r>
+      </w:hyperlink>
+    </w:p>
+    <w:p>
+      <w:pPr>
+        <w:pStyle w:val="ListParagraph"/>
+        <w:numPr>
+          <w:ilvl w:val="0"/>
+          <w:numId w:val="2"/>
+        </w:numPr>
+        <w:spacing w:after="100" w:line="288"/>
+      </w:pPr>
+      <w:r>
+        <w:rPr>
+          <w:sz w:val="22"/>
+          <w:szCs w:val="22"/>
+        </w:rPr>
+        <w:t xml:space="preserve">The cost of acquiring vs. retaining a customer (roughly 5x or more): </w:t>
+      </w:r>
+      <w:hyperlink w:history="1" r:id="rIdmyk71j6voonmbdr9jsjd9">
+        <w:r>
+          <w:rPr>
+            <w:rStyle w:val="Hyperlink"/>
+            <w:sz w:val="22"/>
+            <w:szCs w:val="22"/>
+          </w:rPr>
+          <w:t xml:space="preserve">Harvard Business Review</w:t>
+        </w:r>
+      </w:hyperlink>
+    </w:p>
     <w:sectPr>
-      <w:footerReference w:type="default" r:id="rId7"/>
+      <w:footerReference w:type="default" r:id="rId6"/>
       <w:pgSz w:w="12240" w:h="15840" w:orient="portrait"/>
       <w:pgMar w:top="1440" w:right="1440" w:bottom="1440" w:left="1440" w:header="708" w:footer="708" w:gutter="0"/>
       <w:pgNumType/>
@@ -648,10 +792,6 @@
     </w:sectPr>
   </w:body>
 </w:document>
-</file>
-
-<file path=word/comments.xml><?xml version="1.0" encoding="utf-8"?>
-<w:comments xmlns:cx="http://schemas.microsoft.com/office/drawing/2014/chartex" xmlns:cx1="http://schemas.microsoft.com/office/drawing/2015/9/8/chartex" xmlns:cx2="http://schemas.microsoft.com/office/drawing/2015/10/21/chartex" xmlns:cx3="http://schemas.microsoft.com/office/drawing/2016/5/9/chartex" xmlns:cx4="http://schemas.microsoft.com/office/drawing/2016/5/10/chartex" xmlns:cx5="http://schemas.microsoft.com/office/drawing/2016/5/11/chartex" xmlns:cx6="http://schemas.microsoft.com/office/drawing/2016/5/12/chartex" xmlns:cx7="http://schemas.microsoft.com/office/drawing/2016/5/13/chartex" xmlns:cx8="http://schemas.microsoft.com/office/drawing/2016/5/14/chartex" xmlns:mc="http://schemas.openxmlformats.org/markup-compatibility/2006" xmlns:aink="http://schemas.microsoft.com/office/drawing/2016/ink" xmlns:am3d="http://schemas.microsoft.com/office/drawing/2017/model3d" xmlns:o="urn:schemas-microsoft-com:office:office" xmlns:r="http://schemas.openxmlformats.org/officeDocument/2006/relationships" xmlns:m="http://schemas.openxmlformats.org/officeDocument/2006/math" xmlns:v="urn:schemas-microsoft-com:vml" xmlns:wp14="http://schemas.microsoft.com/office/word/2010/wordprocessingDrawing" xmlns:wp="http://schemas.openxmlformats.org/drawingml/2006/wordprocessingDrawing" xmlns:w10="urn:schemas-microsoft-com:office:word" xmlns:w="http://schemas.openxmlformats.org/wordprocessingml/2006/main" xmlns:w14="http://schemas.microsoft.com/office/word/2010/wordml" xmlns:w15="http://schemas.microsoft.com/office/word/2012/wordml" xmlns:w16cex="http://schemas.microsoft.com/office/word/2018/wordml/cex" xmlns:w16cid="http://schemas.microsoft.com/office/word/2016/wordml/cid" xmlns:w16="http://schemas.microsoft.com/office/word/2018/wordml" xmlns:w16sdtdh="http://schemas.microsoft.com/office/word/2020/wordml/sdtdatahash" xmlns:w16se="http://schemas.microsoft.com/office/word/2015/wordml/symex" xmlns:wpg="http://schemas.microsoft.com/office/word/2010/wordprocessingGroup" xmlns:wpi="http://schemas.microsoft.com/office/word/2010/wordprocessingInk" xmlns:wne="http://schemas.microsoft.com/office/word/2006/wordml" xmlns:wps="http://schemas.microsoft.com/office/word/2010/wordprocessingShape"/>
 </file>
 
 <file path=word/endnotes.xml><?xml version="1.0" encoding="utf-8"?>
@@ -754,7 +894,7 @@
 <w:numbering xmlns:wpc="http://schemas.microsoft.com/office/word/2010/wordprocessingCanvas" xmlns:mc="http://schemas.openxmlformats.org/markup-compatibility/2006" xmlns:o="urn:schemas-microsoft-com:office:office" xmlns:r="http://schemas.openxmlformats.org/officeDocument/2006/relationships" xmlns:m="http://schemas.openxmlformats.org/officeDocument/2006/math" xmlns:v="urn:schemas-microsoft-com:vml" xmlns:wp14="http://schemas.microsoft.com/office/word/2010/wordprocessingDrawing" xmlns:wp="http://schemas.openxmlformats.org/drawingml/2006/wordprocessingDrawing" xmlns:w10="urn:schemas-microsoft-com:office:word" xmlns:w="http://schemas.openxmlformats.org/wordprocessingml/2006/main" xmlns:w14="http://schemas.microsoft.com/office/word/2010/wordml" xmlns:w15="http://schemas.microsoft.com/office/word/2012/wordml" xmlns:wpg="http://schemas.microsoft.com/office/word/2010/wordprocessingGroup" xmlns:wpi="http://schemas.microsoft.com/office/word/2010/wordprocessingInk" xmlns:wne="http://schemas.microsoft.com/office/word/2006/wordml" xmlns:wps="http://schemas.microsoft.com/office/word/2010/wordprocessingShape" mc:Ignorable="w14 w15 wp14">
   <w:abstractNum w:abstractNumId="1" w15:restartNumberingAfterBreak="0">
     <w:multiLevelType w:val="hybridMultilevel"/>
-    <w:lvl w:ilvl="0" w15:tentative="1">
+    <w:lvl w:ilvl="0" w:tentative="1">
       <w:start w:val="1"/>
       <w:numFmt w:val="bullet"/>
       <w:lvlText w:val="●"/>
@@ -763,7 +903,7 @@
         <w:ind w:left="720" w:hanging="360"/>
       </w:pPr>
     </w:lvl>
-    <w:lvl w:ilvl="1" w15:tentative="1">
+    <w:lvl w:ilvl="1" w:tentative="1">
       <w:start w:val="1"/>
       <w:numFmt w:val="bullet"/>
       <w:lvlText w:val="○"/>
@@ -772,7 +912,7 @@
         <w:ind w:left="1440" w:hanging="360"/>
       </w:pPr>
     </w:lvl>
-    <w:lvl w:ilvl="2" w15:tentative="1">
+    <w:lvl w:ilvl="2" w:tentative="1">
       <w:start w:val="1"/>
       <w:numFmt w:val="bullet"/>
       <w:lvlText w:val="■"/>
@@ -781,7 +921,7 @@
         <w:ind w:left="2160" w:hanging="360"/>
       </w:pPr>
     </w:lvl>
-    <w:lvl w:ilvl="3" w15:tentative="1">
+    <w:lvl w:ilvl="3" w:tentative="1">
       <w:start w:val="1"/>
       <w:numFmt w:val="bullet"/>
       <w:lvlText w:val="●"/>
@@ -790,7 +930,7 @@
         <w:ind w:left="2880" w:hanging="360"/>
       </w:pPr>
     </w:lvl>
-    <w:lvl w:ilvl="4" w15:tentative="1">
+    <w:lvl w:ilvl="4" w:tentative="1">
       <w:start w:val="1"/>
       <w:numFmt w:val="bullet"/>
       <w:lvlText w:val="○"/>
@@ -799,7 +939,7 @@
         <w:ind w:left="3600" w:hanging="360"/>
       </w:pPr>
     </w:lvl>
-    <w:lvl w:ilvl="5" w15:tentative="1">
+    <w:lvl w:ilvl="5" w:tentative="1">
       <w:start w:val="1"/>
       <w:numFmt w:val="bullet"/>
       <w:lvlText w:val="■"/>
@@ -808,7 +948,7 @@
         <w:ind w:left="4320" w:hanging="360"/>
       </w:pPr>
     </w:lvl>
-    <w:lvl w:ilvl="6" w15:tentative="1">
+    <w:lvl w:ilvl="6" w:tentative="1">
       <w:start w:val="1"/>
       <w:numFmt w:val="bullet"/>
       <w:lvlText w:val="●"/>
@@ -817,7 +957,7 @@
         <w:ind w:left="5040" w:hanging="360"/>
       </w:pPr>
     </w:lvl>
-    <w:lvl w:ilvl="7" w15:tentative="1">
+    <w:lvl w:ilvl="7" w:tentative="1">
       <w:start w:val="1"/>
       <w:numFmt w:val="bullet"/>
       <w:lvlText w:val="●"/>
@@ -826,7 +966,7 @@
         <w:ind w:left="5760" w:hanging="360"/>
       </w:pPr>
     </w:lvl>
-    <w:lvl w:ilvl="8" w15:tentative="1">
+    <w:lvl w:ilvl="8" w:tentative="1">
       <w:start w:val="1"/>
       <w:numFmt w:val="bullet"/>
       <w:lvlText w:val="●"/>
@@ -838,7 +978,7 @@
   </w:abstractNum>
   <w:abstractNum w:abstractNumId="2" w15:restartNumberingAfterBreak="0">
     <w:multiLevelType w:val="hybridMultilevel"/>
-    <w:lvl w:ilvl="0" w15:tentative="1">
+    <w:lvl w:ilvl="0" w:tentative="1">
       <w:start w:val="1"/>
       <w:numFmt w:val="bullet"/>
       <w:lvlText w:val="•"/>
@@ -876,6 +1016,25 @@
     </w:rPrDefault>
     <w:pPrDefault/>
   </w:docDefaults>
+  <w:style w:type="paragraph" w:styleId="Normal" w:default="1">
+    <w:name w:val="Normal"/>
+    <w:qFormat/>
+  </w:style>
+  <w:style w:type="table" w:styleId="TableNormal" w:default="true">
+    <w:name w:val="Normal Table"/>
+    <w:uiPriority w:val="99"/>
+    <w:semiHidden/>
+    <w:unhideWhenUsed/>
+    <w:tblPr>
+      <w:tblInd w:type="dxa" w:w="0"/>
+      <w:tblCellMar>
+        <w:top w:type="dxa" w:w="0"/>
+        <w:left w:type="dxa" w:w="108"/>
+        <w:bottom w:type="dxa" w:w="0"/>
+        <w:right w:type="dxa" w:w="108"/>
+      </w:tblCellMar>
+    </w:tblPr>
+  </w:style>
   <w:style w:type="paragraph" w:styleId="Title">
     <w:name w:val="Title"/>
     <w:basedOn w:val="Normal"/>
@@ -1048,4 +1207,294 @@
     </w:rPr>
   </w:style>
 </w:styles>
+</file>
+
+<file path=word/theme/theme1.xml><?xml version="1.0" encoding="utf-8"?>
+<a:theme xmlns:a="http://schemas.openxmlformats.org/drawingml/2006/main" name="Office Theme">
+  <a:themeElements>
+    <a:clrScheme name="Office">
+      <a:dk1>
+        <a:sysClr val="windowText" lastClr="000000"/>
+      </a:dk1>
+      <a:lt1>
+        <a:sysClr val="window" lastClr="FFFFFF"/>
+      </a:lt1>
+      <a:dk2>
+        <a:srgbClr val="44546A"/>
+      </a:dk2>
+      <a:lt2>
+        <a:srgbClr val="E7E6E6"/>
+      </a:lt2>
+      <a:accent1>
+        <a:srgbClr val="4472C4"/>
+      </a:accent1>
+      <a:accent2>
+        <a:srgbClr val="ED7D31"/>
+      </a:accent2>
+      <a:accent3>
+        <a:srgbClr val="A5A5A5"/>
+      </a:accent3>
+      <a:accent4>
+        <a:srgbClr val="FFC000"/>
+      </a:accent4>
+      <a:accent5>
+        <a:srgbClr val="5B9BD5"/>
+      </a:accent5>
+      <a:accent6>
+        <a:srgbClr val="70AD47"/>
+      </a:accent6>
+      <a:hlink>
+        <a:srgbClr val="0563C1"/>
+      </a:hlink>
+      <a:folHlink>
+        <a:srgbClr val="954F72"/>
+      </a:folHlink>
+    </a:clrScheme>
+    <a:fontScheme name="Office">
+      <a:majorFont>
+        <a:latin typeface="Calibri Light" panose="020F0302020204030204"/>
+        <a:ea typeface=""/>
+        <a:cs typeface=""/>
+        <a:font script="Jpan" typeface="游ゴシック Light"/>
+        <a:font script="Hang" typeface="맑은 고딕"/>
+        <a:font script="Hans" typeface="等线 Light"/>
+        <a:font script="Hant" typeface="新細明體"/>
+        <a:font script="Arab" typeface="Times New Roman"/>
+        <a:font script="Hebr" typeface="Times New Roman"/>
+        <a:font script="Thai" typeface="Angsana New"/>
+        <a:font script="Ethi" typeface="Nyala"/>
+        <a:font script="Beng" typeface="Vrinda"/>
+        <a:font script="Gujr" typeface="Shruti"/>
+        <a:font script="Khmr" typeface="MoolBoran"/>
+        <a:font script="Knda" typeface="Tunga"/>
+        <a:font script="Guru" typeface="Raavi"/>
+        <a:font script="Cans" typeface="Euphemia"/>
+        <a:font script="Cher" typeface="Plantagenet Cherokee"/>
+        <a:font script="Yiii" typeface="Microsoft Yi Baiti"/>
+        <a:font script="Tibt" typeface="Microsoft Himalaya"/>
+        <a:font script="Thaa" typeface="MV Boli"/>
+        <a:font script="Deva" typeface="Mangal"/>
+        <a:font script="Telu" typeface="Gautami"/>
+        <a:font script="Taml" typeface="Latha"/>
+        <a:font script="Syrc" typeface="Estrangelo Edessa"/>
+        <a:font script="Orya" typeface="Kalinga"/>
+        <a:font script="Mlym" typeface="Kartika"/>
+        <a:font script="Laoo" typeface="DokChampa"/>
+        <a:font script="Sinh" typeface="Iskoola Pota"/>
+        <a:font script="Mong" typeface="Mongolian Baiti"/>
+        <a:font script="Viet" typeface="Times New Roman"/>
+        <a:font script="Uigh" typeface="Microsoft Uighur"/>
+        <a:font script="Geor" typeface="Sylfaen"/>
+        <a:font script="Armn" typeface="Arial"/>
+        <a:font script="Bugi" typeface="Leelawadee UI"/>
+        <a:font script="Bopo" typeface="Microsoft JhengHei"/>
+        <a:font script="Java" typeface="Javanese Text"/>
+        <a:font script="Lisu" typeface="Segoe UI"/>
+        <a:font script="Mymr" typeface="Myanmar Text"/>
+        <a:font script="Nkoo" typeface="Ebrima"/>
+        <a:font script="Olck" typeface="Nirmala UI"/>
+        <a:font script="Osma" typeface="Ebrima"/>
+        <a:font script="Phag" typeface="Phagspa"/>
+        <a:font script="Syrn" typeface="Estrangelo Edessa"/>
+        <a:font script="Syrj" typeface="Estrangelo Edessa"/>
+        <a:font script="Syre" typeface="Estrangelo Edessa"/>
+        <a:font script="Sora" typeface="Nirmala UI"/>
+        <a:font script="Tale" typeface="Microsoft Tai Le"/>
+        <a:font script="Talu" typeface="Microsoft New Tai Lue"/>
+        <a:font script="Tfng" typeface="Ebrima"/>
+      </a:majorFont>
+      <a:minorFont>
+        <a:latin typeface="Calibri" panose="020F0502020204030204"/>
+        <a:ea typeface=""/>
+        <a:cs typeface=""/>
+        <a:font script="Jpan" typeface="游明朝"/>
+        <a:font script="Hang" typeface="맑은 고딕"/>
+        <a:font script="Hans" typeface="等线"/>
+        <a:font script="Hant" typeface="新細明體"/>
+        <a:font script="Arab" typeface="Arial"/>
+        <a:font script="Hebr" typeface="Arial"/>
+        <a:font script="Thai" typeface="Cordia New"/>
+        <a:font script="Ethi" typeface="Nyala"/>
+        <a:font script="Beng" typeface="Vrinda"/>
+        <a:font script="Gujr" typeface="Shruti"/>
+        <a:font script="Khmr" typeface="DaunPenh"/>
+        <a:font script="Knda" typeface="Tunga"/>
+        <a:font script="Guru" typeface="Raavi"/>
+        <a:font script="Cans" typeface="Euphemia"/>
+        <a:font script="Cher" typeface="Plantagenet Cherokee"/>
+        <a:font script="Yiii" typeface="Microsoft Yi Baiti"/>
+        <a:font script="Tibt" typeface="Microsoft Himalaya"/>
+        <a:font script="Thaa" typeface="MV Boli"/>
+        <a:font script="Deva" typeface="Mangal"/>
+        <a:font script="Telu" typeface="Gautami"/>
+        <a:font script="Taml" typeface="Latha"/>
+        <a:font script="Syrc" typeface="Estrangelo Edessa"/>
+        <a:font script="Orya" typeface="Kalinga"/>
+        <a:font script="Mlym" typeface="Kartika"/>
+        <a:font script="Laoo" typeface="DokChampa"/>
+        <a:font script="Sinh" typeface="Iskoola Pota"/>
+        <a:font script="Mong" typeface="Mongolian Baiti"/>
+        <a:font script="Viet" typeface="Arial"/>
+        <a:font script="Uigh" typeface="Microsoft Uighur"/>
+        <a:font script="Geor" typeface="Sylfaen"/>
+        <a:font script="Armn" typeface="Arial"/>
+        <a:font script="Bugi" typeface="Leelawadee UI"/>
+        <a:font script="Bopo" typeface="Microsoft JhengHei"/>
+        <a:font script="Java" typeface="Javanese Text"/>
+        <a:font script="Lisu" typeface="Segoe UI"/>
+        <a:font script="Mymr" typeface="Myanmar Text"/>
+        <a:font script="Nkoo" typeface="Ebrima"/>
+        <a:font script="Olck" typeface="Nirmala UI"/>
+        <a:font script="Osma" typeface="Ebrima"/>
+        <a:font script="Phag" typeface="Phagspa"/>
+        <a:font script="Syrn" typeface="Estrangelo Edessa"/>
+        <a:font script="Syrj" typeface="Estrangelo Edessa"/>
+        <a:font script="Syre" typeface="Estrangelo Edessa"/>
+        <a:font script="Sora" typeface="Nirmala UI"/>
+        <a:font script="Tale" typeface="Microsoft Tai Le"/>
+        <a:font script="Talu" typeface="Microsoft New Tai Lue"/>
+        <a:font script="Tfng" typeface="Ebrima"/>
+      </a:minorFont>
+    </a:fontScheme>
+    <a:fmtScheme name="Office">
+      <a:fillStyleLst>
+        <a:solidFill>
+          <a:schemeClr val="phClr"/>
+        </a:solidFill>
+        <a:gradFill rotWithShape="true">
+          <a:gsLst>
+            <a:gs pos="0">
+              <a:schemeClr val="phClr">
+                <a:lumMod val="110000"/>
+                <a:satMod val="105000"/>
+                <a:tint val="67000"/>
+              </a:schemeClr>
+            </a:gs>
+            <a:gs pos="50000">
+              <a:schemeClr val="phClr">
+                <a:lumMod val="105000"/>
+                <a:satMod val="103000"/>
+                <a:tint val="73000"/>
+              </a:schemeClr>
+            </a:gs>
+            <a:gs pos="100000">
+              <a:schemeClr val="phClr">
+                <a:lumMod val="105000"/>
+                <a:satMod val="109000"/>
+                <a:tint val="81000"/>
+              </a:schemeClr>
+            </a:gs>
+          </a:gsLst>
+          <a:lin ang="5400000" scaled="false"/>
+        </a:gradFill>
+        <a:gradFill rotWithShape="true">
+          <a:gsLst>
+            <a:gs pos="0">
+              <a:schemeClr val="phClr">
+                <a:satMod val="103000"/>
+                <a:lumMod val="102000"/>
+                <a:tint val="94000"/>
+              </a:schemeClr>
+            </a:gs>
+            <a:gs pos="50000">
+              <a:schemeClr val="phClr">
+                <a:satMod val="110000"/>
+                <a:lumMod val="100000"/>
+                <a:shade val="100000"/>
+              </a:schemeClr>
+            </a:gs>
+            <a:gs pos="100000">
+              <a:schemeClr val="phClr">
+                <a:lumMod val="99000"/>
+                <a:satMod val="120000"/>
+                <a:shade val="78000"/>
+              </a:schemeClr>
+            </a:gs>
+          </a:gsLst>
+          <a:lin ang="5400000" scaled="false"/>
+        </a:gradFill>
+      </a:fillStyleLst>
+      <a:lnStyleLst>
+        <a:ln w="6350" cap="flat" cmpd="sng" algn="ctr">
+          <a:solidFill>
+            <a:schemeClr val="phClr"/>
+          </a:solidFill>
+          <a:prstDash val="solid"/>
+          <a:miter lim="800000"/>
+        </a:ln>
+        <a:ln w="12700" cap="flat" cmpd="sng" algn="ctr">
+          <a:solidFill>
+            <a:schemeClr val="phClr"/>
+          </a:solidFill>
+          <a:prstDash val="solid"/>
+          <a:miter lim="800000"/>
+        </a:ln>
+        <a:ln w="19050" cap="flat" cmpd="sng" algn="ctr">
+          <a:solidFill>
+            <a:schemeClr val="phClr"/>
+          </a:solidFill>
+          <a:prstDash val="solid"/>
+          <a:miter lim="800000"/>
+        </a:ln>
+      </a:lnStyleLst>
+      <a:effectStyleLst>
+        <a:effectStyle>
+          <a:effectLst/>
+        </a:effectStyle>
+        <a:effectStyle>
+          <a:effectLst/>
+        </a:effectStyle>
+        <a:effectStyle>
+          <a:effectLst>
+            <a:outerShdw blurRad="57150" dist="19050" dir="5400000" algn="ctr" rotWithShape="false">
+              <a:srgbClr val="000000">
+                <a:alpha val="63000"/>
+              </a:srgbClr>
+            </a:outerShdw>
+          </a:effectLst>
+        </a:effectStyle>
+      </a:effectStyleLst>
+      <a:bgFillStyleLst>
+        <a:solidFill>
+          <a:schemeClr val="phClr"/>
+        </a:solidFill>
+        <a:solidFill>
+          <a:schemeClr val="phClr">
+            <a:tint val="95000"/>
+            <a:satMod val="170000"/>
+          </a:schemeClr>
+        </a:solidFill>
+        <a:gradFill rotWithShape="true">
+          <a:gsLst>
+            <a:gs pos="0">
+              <a:schemeClr val="phClr">
+                <a:tint val="93000"/>
+                <a:satMod val="150000"/>
+                <a:shade val="98000"/>
+                <a:lumMod val="102000"/>
+              </a:schemeClr>
+            </a:gs>
+            <a:gs pos="50000">
+              <a:schemeClr val="phClr">
+                <a:tint val="98000"/>
+                <a:satMod val="130000"/>
+                <a:shade val="90000"/>
+                <a:lumMod val="103000"/>
+              </a:schemeClr>
+            </a:gs>
+            <a:gs pos="100000">
+              <a:schemeClr val="phClr">
+                <a:shade val="63000"/>
+                <a:satMod val="120000"/>
+              </a:schemeClr>
+            </a:gs>
+          </a:gsLst>
+          <a:lin ang="5400000" scaled="false"/>
+        </a:gradFill>
+      </a:bgFillStyleLst>
+    </a:fmtScheme>
+  </a:themeElements>
+  <a:objectDefaults/>
+  <a:extraClrSchemeLst/>
+</a:theme>
 </file>
</xml_diff>